<commit_message>
Task 4 updated, mostly stylized
</commit_message>
<xml_diff>
--- a/LAB4Report.docx
+++ b/LAB4Report.docx
@@ -157,6 +157,9 @@
     </w:p>
     <w:p>
       <w:r>
+        <w:rPr>
+          <w:noProof/>
+        </w:rPr>
         <w:drawing>
           <wp:inline distT="0" distB="0" distL="0" distR="0" wp14:anchorId="48F72974" wp14:editId="39F05A02">
             <wp:extent cx="6152515" cy="3315970"/>
@@ -196,6 +199,9 @@
     </w:p>
     <w:p>
       <w:r>
+        <w:rPr>
+          <w:noProof/>
+        </w:rPr>
         <w:drawing>
           <wp:inline distT="0" distB="0" distL="0" distR="0" wp14:anchorId="4312D8D5" wp14:editId="09398FDF">
             <wp:extent cx="6152515" cy="2834005"/>
@@ -277,7 +283,7 @@
         <w:t xml:space="preserve">Page = </w:t>
       </w:r>
       <w:r>
-        <w:t>Lab4 Bookmarks and Buttons</w:t>
+        <w:t>Map &amp; BarChart views</w:t>
       </w:r>
     </w:p>
     <w:p>
@@ -352,7 +358,7 @@
         <w:t xml:space="preserve">page = </w:t>
       </w:r>
       <w:r>
-        <w:t>Task 3 page1</w:t>
+        <w:t>Sales&amp;Quantities TD Comparisions 3.1</w:t>
       </w:r>
     </w:p>
     <w:p>
@@ -429,10 +435,10 @@
           <w:noProof/>
         </w:rPr>
         <w:drawing>
-          <wp:inline distT="0" distB="0" distL="0" distR="0" wp14:anchorId="445E1AA6" wp14:editId="5890CFF0">
-            <wp:extent cx="1168107" cy="1415076"/>
-            <wp:effectExtent l="0" t="0" r="0" b="0"/>
-            <wp:docPr id="674640760" name="Picture 1"/>
+          <wp:inline distT="0" distB="0" distL="0" distR="0" wp14:anchorId="155F134F" wp14:editId="3F6B42E5">
+            <wp:extent cx="1676634" cy="2124371"/>
+            <wp:effectExtent l="0" t="0" r="0" b="9525"/>
+            <wp:docPr id="306139627" name="Picture 1" descr="A screenshot of a computer&#10;&#10;AI-generated content may be incorrect."/>
             <wp:cNvGraphicFramePr>
               <a:graphicFrameLocks xmlns:a="http://schemas.openxmlformats.org/drawingml/2006/main" noChangeAspect="1"/>
             </wp:cNvGraphicFramePr>
@@ -440,7 +446,7 @@
               <a:graphicData uri="http://schemas.openxmlformats.org/drawingml/2006/picture">
                 <pic:pic xmlns:pic="http://schemas.openxmlformats.org/drawingml/2006/picture">
                   <pic:nvPicPr>
-                    <pic:cNvPr id="674640760" name=""/>
+                    <pic:cNvPr id="306139627" name="Picture 1" descr="A screenshot of a computer&#10;&#10;AI-generated content may be incorrect."/>
                     <pic:cNvPicPr/>
                   </pic:nvPicPr>
                   <pic:blipFill>
@@ -452,7 +458,7 @@
                   <pic:spPr>
                     <a:xfrm>
                       <a:off x="0" y="0"/>
-                      <a:ext cx="1186650" cy="1437540"/>
+                      <a:ext cx="1676634" cy="2124371"/>
                     </a:xfrm>
                     <a:prstGeom prst="rect">
                       <a:avLst/>
@@ -502,20 +508,28 @@
     </w:p>
     <w:p>
       <w:pPr>
+        <w:ind w:left="360"/>
+      </w:pPr>
+      <w:r>
+        <w:t xml:space="preserve">Page = </w:t>
+      </w:r>
+      <w:r>
+        <w:t>Sales Decomposition Tree</w:t>
+      </w:r>
+    </w:p>
+    <w:p>
+      <w:pPr>
         <w:ind w:left="720"/>
       </w:pPr>
     </w:p>
     <w:p>
       <w:r>
-        <w:rPr>
-          <w:noProof/>
-        </w:rPr>
         <w:lastRenderedPageBreak/>
         <w:drawing>
-          <wp:inline distT="0" distB="0" distL="0" distR="0" wp14:anchorId="186B8B47" wp14:editId="13562065">
-            <wp:extent cx="6152515" cy="2876550"/>
-            <wp:effectExtent l="0" t="0" r="635" b="0"/>
-            <wp:docPr id="408765322" name="Picture 1"/>
+          <wp:inline distT="0" distB="0" distL="0" distR="0" wp14:anchorId="0AD6D83C" wp14:editId="70FC0465">
+            <wp:extent cx="6134956" cy="3429479"/>
+            <wp:effectExtent l="0" t="0" r="0" b="0"/>
+            <wp:docPr id="1968454517" name="Picture 1" descr="A screenshot of a computer&#10;&#10;AI-generated content may be incorrect."/>
             <wp:cNvGraphicFramePr>
               <a:graphicFrameLocks xmlns:a="http://schemas.openxmlformats.org/drawingml/2006/main" noChangeAspect="1"/>
             </wp:cNvGraphicFramePr>
@@ -523,7 +537,7 @@
               <a:graphicData uri="http://schemas.openxmlformats.org/drawingml/2006/picture">
                 <pic:pic xmlns:pic="http://schemas.openxmlformats.org/drawingml/2006/picture">
                   <pic:nvPicPr>
-                    <pic:cNvPr id="408765322" name=""/>
+                    <pic:cNvPr id="1968454517" name="Picture 1" descr="A screenshot of a computer&#10;&#10;AI-generated content may be incorrect."/>
                     <pic:cNvPicPr/>
                   </pic:nvPicPr>
                   <pic:blipFill>
@@ -535,7 +549,7 @@
                   <pic:spPr>
                     <a:xfrm>
                       <a:off x="0" y="0"/>
-                      <a:ext cx="6152515" cy="2876550"/>
+                      <a:ext cx="6134956" cy="3429479"/>
                     </a:xfrm>
                     <a:prstGeom prst="rect">
                       <a:avLst/>
@@ -581,6 +595,12 @@
         </w:rPr>
         <w:t>shows detail of hovered country.</w:t>
       </w:r>
+      <w:r>
+        <w:rPr>
+          <w:noProof/>
+        </w:rPr>
+        <w:t xml:space="preserve"> </w:t>
+      </w:r>
     </w:p>
     <w:p>
       <w:pPr>
@@ -593,22 +613,11 @@
         <w:rPr>
           <w:noProof/>
         </w:rPr>
-        <w:t>Tooltip consists of bar chart that shows sales amount by regions and multi row card tha shows name of country and total sales.</w:t>
-      </w:r>
-    </w:p>
-    <w:p>
-      <w:pPr>
-        <w:ind w:left="720"/>
-      </w:pPr>
-      <w:r>
-        <w:rPr>
-          <w:noProof/>
-        </w:rPr>
         <w:drawing>
-          <wp:inline distT="0" distB="0" distL="0" distR="0" wp14:anchorId="61651C81" wp14:editId="7F03608B">
-            <wp:extent cx="4115374" cy="3848637"/>
-            <wp:effectExtent l="0" t="0" r="0" b="0"/>
-            <wp:docPr id="1929426498" name="Picture 1"/>
+          <wp:inline distT="0" distB="0" distL="0" distR="0" wp14:anchorId="3EA46451" wp14:editId="495934BD">
+            <wp:extent cx="3118514" cy="3524101"/>
+            <wp:effectExtent l="0" t="0" r="5715" b="635"/>
+            <wp:docPr id="1496326347" name="Picture 1" descr="A screenshot of a computer screen&#10;&#10;AI-generated content may be incorrect."/>
             <wp:cNvGraphicFramePr>
               <a:graphicFrameLocks xmlns:a="http://schemas.openxmlformats.org/drawingml/2006/main" noChangeAspect="1"/>
             </wp:cNvGraphicFramePr>
@@ -616,7 +625,7 @@
               <a:graphicData uri="http://schemas.openxmlformats.org/drawingml/2006/picture">
                 <pic:pic xmlns:pic="http://schemas.openxmlformats.org/drawingml/2006/picture">
                   <pic:nvPicPr>
-                    <pic:cNvPr id="1929426498" name=""/>
+                    <pic:cNvPr id="1496326347" name="Picture 1" descr="A screenshot of a computer screen&#10;&#10;AI-generated content may be incorrect."/>
                     <pic:cNvPicPr/>
                   </pic:nvPicPr>
                   <pic:blipFill>
@@ -628,7 +637,7 @@
                   <pic:spPr>
                     <a:xfrm>
                       <a:off x="0" y="0"/>
-                      <a:ext cx="4115374" cy="3848637"/>
+                      <a:ext cx="3138205" cy="3546353"/>
                     </a:xfrm>
                     <a:prstGeom prst="rect">
                       <a:avLst/>
@@ -643,18 +652,34 @@
     </w:p>
     <w:p>
       <w:pPr>
-        <w:ind w:left="360"/>
+        <w:ind w:left="720"/>
+        <w:rPr>
+          <w:noProof/>
+        </w:rPr>
       </w:pPr>
       <w:r>
         <w:rPr>
           <w:noProof/>
         </w:rPr>
         <w:lastRenderedPageBreak/>
+        <w:t>Tooltip consists of bar chart that shows sales amount by regions and multi row card tha shows name of country and total sales.</w:t>
+      </w:r>
+    </w:p>
+    <w:p>
+      <w:pPr>
+        <w:ind w:left="720"/>
+      </w:pPr>
+    </w:p>
+    <w:p>
+      <w:pPr>
+        <w:ind w:left="360"/>
+      </w:pPr>
+      <w:r>
         <w:drawing>
-          <wp:inline distT="0" distB="0" distL="0" distR="0" wp14:anchorId="1EA369D3" wp14:editId="7E1F825D">
-            <wp:extent cx="2734057" cy="3334215"/>
+          <wp:inline distT="0" distB="0" distL="0" distR="0" wp14:anchorId="7F7F182B" wp14:editId="2D280285">
+            <wp:extent cx="2162477" cy="2686425"/>
             <wp:effectExtent l="0" t="0" r="9525" b="0"/>
-            <wp:docPr id="317957878" name="Picture 1"/>
+            <wp:docPr id="1752667377" name="Picture 1" descr="A graph of a number of countries/regions&#10;&#10;AI-generated content may be incorrect."/>
             <wp:cNvGraphicFramePr>
               <a:graphicFrameLocks xmlns:a="http://schemas.openxmlformats.org/drawingml/2006/main" noChangeAspect="1"/>
             </wp:cNvGraphicFramePr>
@@ -662,7 +687,7 @@
               <a:graphicData uri="http://schemas.openxmlformats.org/drawingml/2006/picture">
                 <pic:pic xmlns:pic="http://schemas.openxmlformats.org/drawingml/2006/picture">
                   <pic:nvPicPr>
-                    <pic:cNvPr id="317957878" name=""/>
+                    <pic:cNvPr id="1752667377" name="Picture 1" descr="A graph of a number of countries/regions&#10;&#10;AI-generated content may be incorrect."/>
                     <pic:cNvPicPr/>
                   </pic:nvPicPr>
                   <pic:blipFill>
@@ -674,7 +699,7 @@
                   <pic:spPr>
                     <a:xfrm>
                       <a:off x="0" y="0"/>
-                      <a:ext cx="2734057" cy="3334215"/>
+                      <a:ext cx="2162477" cy="2686425"/>
                     </a:xfrm>
                     <a:prstGeom prst="rect">
                       <a:avLst/>

</xml_diff>